<commit_message>
fix: keep repeated-value entries anchored using case-insensitive occurrence counts
</commit_message>
<xml_diff>
--- a/02. Hồ sơ khoa học đề cương - MẪU/07. BB kiểm phiếu thông qua đề cương.docx
+++ b/02. Hồ sơ khoa học đề cương - MẪU/07. BB kiểm phiếu thông qua đề cương.docx
@@ -133,7 +133,7 @@
                 <w:b/>
                 <w:lang w:val="fr-FR"/>
               </w:rPr>
-              <w:t>{{DON_VI_CHU_TRI}}</w:t>
+              <w:t>VIỆN Y HỌC ỨNG DỤNG VIỆT NAM</w:t>
             </w:r>
           </w:p>
         </w:tc>
@@ -931,15 +931,7 @@
           <w:szCs w:val="28"/>
           <w:lang w:val="pt-PT"/>
         </w:rPr>
-        <w:t xml:space="preserve"> </w:t>
-      </w:r>
-      <w:r>
-        <w:rPr>
-          <w:sz w:val="28"/>
-          <w:szCs w:val="28"/>
-          <w:lang w:val="pt-PT"/>
-        </w:rPr>
-        <w:t>{{DON_VI_CHU_TRI}}</w:t>
+        <w:t xml:space="preserve"> Viện Y học ứng dụng Việt Nam</w:t>
       </w:r>
       <w:r>
         <w:rPr>
@@ -1096,23 +1088,7 @@
           <w:szCs w:val="28"/>
           <w:lang w:val="vi-VN"/>
         </w:rPr>
-        <w:t>Đơn vị thực hiện:</w:t>
-      </w:r>
-      <w:r>
-        <w:rPr>
-          <w:sz w:val="28"/>
-          <w:szCs w:val="28"/>
-          <w:lang w:val="vi-VN"/>
-        </w:rPr>
-        <w:t xml:space="preserve"> </w:t>
-      </w:r>
-      <w:r>
-        <w:rPr>
-          <w:sz w:val="28"/>
-          <w:szCs w:val="28"/>
-          <w:lang w:val="vi-VN"/>
-        </w:rPr>
-        <w:t>{{DON_VI_CHU_TRI}}</w:t>
+        <w:t>Đơn vị thực hiện: {{DON_VI_CHU_TRI}}</w:t>
       </w:r>
     </w:p>
     <w:p>
@@ -1356,7 +1332,23 @@
           <w:szCs w:val="28"/>
           <w:lang w:val="vi-VN"/>
         </w:rPr>
-        <w:t>{{DON_VI_CHU_TRI}}</w:t>
+        <w:t xml:space="preserve">Viện Y học ứng dụng Việt </w:t>
+      </w:r>
+      <w:r>
+        <w:rPr>
+          <w:sz w:val="28"/>
+          <w:szCs w:val="28"/>
+          <w:lang w:val="vi-VN"/>
+        </w:rPr>
+        <w:t>N</w:t>
+      </w:r>
+      <w:r>
+        <w:rPr>
+          <w:sz w:val="28"/>
+          <w:szCs w:val="28"/>
+          <w:lang w:val="vi-VN"/>
+        </w:rPr>
+        <w:t>am</w:t>
       </w:r>
     </w:p>
     <w:p>

</xml_diff>